<commit_message>
Banco, fatia 6 no app: o Measure da página oficial com o Supabase
As telas do protótipo gravam no espelho e js/measure-oficial.js leva cada mudança ao banco
(agrupada, com versão na condição e preservando o que ainda não subiu quando o espelho é
relido); plantas no Storage; preços e margens só entram; proposta emitida pela função.
Teste de ponta a ponta tests/measure-oficial.test.mjs (local 25/25, também com latência);
Início da conta, roteiro, portal e docs atualizados.

Co-Authored-By: Claude Fable 5.1 <noreply@anthropic.com>
Claude-Session: https://claude.ai/code/session_01Ep8bJsuQq2bqGePCMzzux2
</commit_message>
<xml_diff>
--- a/portal/files/KORbuild Measure - Prototype status.docx
+++ b/portal/files/KORbuild Measure - Prototype status.docx
@@ -34,7 +34,21 @@
           <w:b w:val="0"/>
           <w:i w:val="0"/>
         </w:rPr>
-        <w:t>What is simulated in the prototype today, and what comes next.</w:t>
+        <w:t xml:space="preserve">The prototype (the demo with sample data) shows the product working. Beside it, the </w:t>
+      </w:r>
+      <w:r>
+        <w:rPr>
+          <w:b/>
+          <w:i w:val="0"/>
+        </w:rPr>
+        <w:t>real account</w:t>
+      </w:r>
+      <w:r>
+        <w:rPr>
+          <w:b w:val="0"/>
+          <w:i w:val="0"/>
+        </w:rPr>
+        <w:t xml:space="preserve"> already runs Measure on the cloud database and is in homologation. This page says what is real today and what is still simulated in the demo.</w:t>
       </w:r>
     </w:p>
     <w:p>
@@ -46,7 +60,172 @@
           <w:b w:val="0"/>
           <w:i w:val="0"/>
         </w:rPr>
-        <w:t>Simulated today</w:t>
+        <w:t>Already running on the database (real account)</w:t>
+      </w:r>
+    </w:p>
+    <w:tbl>
+      <w:tblPr>
+        <w:tblStyle w:val="TableGrid"/>
+        <w:tblW w:type="auto" w:w="0"/>
+        <w:tblLook w:firstColumn="1" w:firstRow="1" w:lastColumn="0" w:lastRow="0" w:noHBand="0" w:noVBand="1" w:val="04A0"/>
+      </w:tblPr>
+      <w:tblGrid>
+        <w:gridCol w:w="4873"/>
+        <w:gridCol w:w="4873"/>
+      </w:tblGrid>
+      <w:tr>
+        <w:tc>
+          <w:tcPr>
+            <w:tcW w:type="dxa" w:w="4873"/>
+          </w:tcPr>
+          <w:p>
+            <w:pPr>
+              <w:shd w:val="clear" w:color="auto" w:fill="F2F4F7"/>
+            </w:pPr>
+            <w:r/>
+            <w:r>
+              <w:rPr>
+                <w:b/>
+                <w:i w:val="0"/>
+                <w:sz w:val="18"/>
+              </w:rPr>
+              <w:t>Item</w:t>
+            </w:r>
+          </w:p>
+        </w:tc>
+        <w:tc>
+          <w:tcPr>
+            <w:tcW w:type="dxa" w:w="4873"/>
+          </w:tcPr>
+          <w:p>
+            <w:pPr>
+              <w:shd w:val="clear" w:color="auto" w:fill="F2F4F7"/>
+            </w:pPr>
+            <w:r/>
+            <w:r>
+              <w:rPr>
+                <w:b/>
+                <w:i w:val="0"/>
+                <w:sz w:val="18"/>
+              </w:rPr>
+              <w:t>How it works today</w:t>
+            </w:r>
+          </w:p>
+        </w:tc>
+      </w:tr>
+      <w:tr>
+        <w:tc>
+          <w:tcPr>
+            <w:tcW w:type="dxa" w:w="4873"/>
+          </w:tcPr>
+          <w:p>
+            <w:r/>
+            <w:r>
+              <w:rPr>
+                <w:b w:val="0"/>
+                <w:i w:val="0"/>
+                <w:sz w:val="18"/>
+              </w:rPr>
+              <w:t>Projects, plans and takeoff</w:t>
+            </w:r>
+          </w:p>
+        </w:tc>
+        <w:tc>
+          <w:tcPr>
+            <w:tcW w:type="dxa" w:w="4873"/>
+          </w:tcPr>
+          <w:p>
+            <w:r/>
+            <w:r>
+              <w:rPr>
+                <w:b w:val="0"/>
+                <w:i w:val="0"/>
+                <w:sz w:val="18"/>
+              </w:rPr>
+              <w:t>Projects, PDF plans (in the company's cloud storage), scale, conditions with their measurements and typicals are saved as you work, on the computer with internet; reopening on another computer shows the same takeoff. Two people on the same condition: the second is warned and sees the database version.</w:t>
+            </w:r>
+          </w:p>
+        </w:tc>
+      </w:tr>
+      <w:tr>
+        <w:tc>
+          <w:tcPr>
+            <w:tcW w:type="dxa" w:w="4873"/>
+          </w:tcPr>
+          <w:p>
+            <w:r/>
+            <w:r>
+              <w:rPr>
+                <w:b w:val="0"/>
+                <w:i w:val="0"/>
+                <w:sz w:val="18"/>
+              </w:rPr>
+              <w:t>Catalog, prices and markups</w:t>
+            </w:r>
+          </w:p>
+        </w:tc>
+        <w:tc>
+          <w:tcPr>
+            <w:tcW w:type="dxa" w:w="4873"/>
+          </w:tcPr>
+          <w:p>
+            <w:r/>
+            <w:r>
+              <w:rPr>
+                <w:b w:val="0"/>
+                <w:i w:val="0"/>
+                <w:sz w:val="18"/>
+              </w:rPr>
+              <w:t>The company's own items and assemblies; prices and markups are versions with effective dates that never change or disappear, with the author recorded. Money is visible only to those with the catalog permission or cost visibility.</w:t>
+            </w:r>
+          </w:p>
+        </w:tc>
+      </w:tr>
+      <w:tr>
+        <w:tc>
+          <w:tcPr>
+            <w:tcW w:type="dxa" w:w="4873"/>
+          </w:tcPr>
+          <w:p>
+            <w:r/>
+            <w:r>
+              <w:rPr>
+                <w:b w:val="0"/>
+                <w:i w:val="0"/>
+                <w:sz w:val="18"/>
+              </w:rPr>
+              <w:t>Proposal</w:t>
+            </w:r>
+          </w:p>
+        </w:tc>
+        <w:tc>
+          <w:tcPr>
+            <w:tcW w:type="dxa" w:w="4873"/>
+          </w:tcPr>
+          <w:p>
+            <w:r/>
+            <w:r>
+              <w:rPr>
+                <w:b w:val="0"/>
+                <w:i w:val="0"/>
+                <w:sz w:val="18"/>
+              </w:rPr>
+              <w:t>Issued proposals are numbered by the database (P-YYYY-NNN, per company and year) and frozen; they stay on record even if the project is deleted.</w:t>
+            </w:r>
+          </w:p>
+        </w:tc>
+      </w:tr>
+    </w:tbl>
+    <w:p>
+      <w:pPr>
+        <w:pStyle w:val="Heading1"/>
+      </w:pPr>
+      <w:r>
+        <w:rPr>
+          <w:b w:val="0"/>
+          <w:i w:val="0"/>
+        </w:rPr>
+        <w:t>Simulated today (in the demo)</w:t>
       </w:r>
     </w:p>
     <w:tbl>
@@ -164,7 +343,23 @@
                 <w:i w:val="0"/>
                 <w:sz w:val="18"/>
               </w:rPr>
-              <w:t>The company's cloud storage, shared by its estimators.</w:t>
+              <w:t xml:space="preserve">The company's cloud storage, shared by its estimators — </w:t>
+            </w:r>
+            <w:r>
+              <w:rPr>
+                <w:b/>
+                <w:i w:val="0"/>
+                <w:sz w:val="18"/>
+              </w:rPr>
+              <w:t>already running</w:t>
+            </w:r>
+            <w:r>
+              <w:rPr>
+                <w:b w:val="0"/>
+                <w:i w:val="0"/>
+                <w:sz w:val="18"/>
+              </w:rPr>
+              <w:t xml:space="preserve"> in the real account.</w:t>
             </w:r>
           </w:p>
         </w:tc>
@@ -346,7 +541,23 @@
                 <w:i w:val="0"/>
                 <w:sz w:val="18"/>
               </w:rPr>
-              <w:t>Each company's own catalog and supplier prices.</w:t>
+              <w:t xml:space="preserve">Each company's own catalog and supplier prices — </w:t>
+            </w:r>
+            <w:r>
+              <w:rPr>
+                <w:b/>
+                <w:i w:val="0"/>
+                <w:sz w:val="18"/>
+              </w:rPr>
+              <w:t>already running</w:t>
+            </w:r>
+            <w:r>
+              <w:rPr>
+                <w:b w:val="0"/>
+                <w:i w:val="0"/>
+                <w:sz w:val="18"/>
+              </w:rPr>
+              <w:t>.</w:t>
             </w:r>
           </w:p>
         </w:tc>

</xml_diff>